<commit_message>
Ottimate Onboarding Specialist: score 83 after confirmations; profile adds 50+ presentations and Accelo invoicing/billing
Co-Authored-By: Claude Opus 5.5 <noreply@anthropic.com>
Claude-Session: https://claude.ai/code/session_018DEej5NGjq1omj9BTtvEiy
</commit_message>
<xml_diff>
--- a/applications/ottimate-onboarding-specialist/Ottimate-OnboardingSpecialist-Resume.docx
+++ b/applications/ottimate-onboarding-specialist/Ottimate-OnboardingSpecialist-Resume.docx
@@ -975,6 +975,30 @@
           <w:i w:val="0"/>
           <w:color w:val="1A1A1A"/>
         </w:rPr>
+        <w:t>Walked clients through Accelo's invoicing and billing features, showing professional-services firms how time, projects, and billing connect in one system.</w:t>
+      </w:r>
+    </w:p>
+    <w:p>
+      <w:pPr>
+        <w:spacing w:after="30"/>
+        <w:ind w:left="259" w:hanging="259"/>
+      </w:pPr>
+      <w:r>
+        <w:rPr>
+          <w:rFonts w:ascii="Calibri" w:hAnsi="Calibri"/>
+          <w:b w:val="0"/>
+          <w:i w:val="0"/>
+          <w:color w:val="163A5F"/>
+        </w:rPr>
+        <w:t xml:space="preserve">•  </w:t>
+      </w:r>
+      <w:r>
+        <w:rPr>
+          <w:rFonts w:ascii="Calibri" w:hAnsi="Calibri"/>
+          <w:b w:val="0"/>
+          <w:i w:val="0"/>
+          <w:color w:val="1A1A1A"/>
+        </w:rPr>
         <w:t>Advised professional-services firms and C-suite stakeholders on CRM adoption and workflow design, escalating risks early to keep projects moving.</w:t>
       </w:r>
     </w:p>
@@ -1017,7 +1041,7 @@
           <w:i w:val="0"/>
           <w:color w:val="1A1A1A"/>
         </w:rPr>
-        <w:t>SaaS Implementation &amp; Go-Live Management, Persona-Based Training &amp; Workshops, 1:1 Deep Dives &amp; Group Training, Time-to-Value Acceleration</w:t>
+        <w:t>SaaS Implementation &amp; Go-Live Management, Persona-Based Training &amp; Workshops, Presentations from 1:1 Deep Dives to Groups of 50+, Time-to-Value Acceleration</w:t>
       </w:r>
     </w:p>
     <w:p>

</xml_diff>